<commit_message>
Complete Week 1 Lab 2
</commit_message>
<xml_diff>
--- a/Fragoso_Sean_CMP129_Week01_Lab02.docx
+++ b/Fragoso_Sean_CMP129_Week01_Lab02.docx
@@ -3,60 +3,337 @@
 <w:document xmlns:wpc="http://schemas.microsoft.com/office/word/2010/wordprocessingCanvas" xmlns:cx="http://schemas.microsoft.com/office/drawing/2014/chartex" xmlns:cx1="http://schemas.microsoft.com/office/drawing/2015/9/8/chartex" xmlns:cx2="http://schemas.microsoft.com/office/drawing/2015/10/21/chartex" xmlns:cx3="http://schemas.microsoft.com/office/drawing/2016/5/9/chartex" xmlns:cx4="http://schemas.microsoft.com/office/drawing/2016/5/10/chartex" xmlns:cx5="http://schemas.microsoft.com/office/drawing/2016/5/11/chartex" xmlns:cx6="http://schemas.microsoft.com/office/drawing/2016/5/12/chartex" xmlns:cx7="http://schemas.microsoft.com/office/drawing/2016/5/13/chartex" xmlns:cx8="http://schemas.microsoft.com/office/drawing/2016/5/14/chartex" xmlns:mc="http://schemas.openxmlformats.org/markup-compatibility/2006" xmlns:aink="http://schemas.microsoft.com/office/drawing/2016/ink" xmlns:am3d="http://schemas.microsoft.com/office/drawing/2017/model3d" xmlns:o="urn:schemas-microsoft-com:office:office" xmlns:oel="http://schemas.microsoft.com/office/2019/extlst" xmlns:r="http://schemas.openxmlformats.org/officeDocument/2006/relationships" xmlns:m="http://schemas.openxmlformats.org/officeDocument/2006/math" xmlns:v="urn:schemas-microsoft-com:vml" xmlns:wp14="http://schemas.microsoft.com/office/word/2010/wordprocessingDrawing" xmlns:wp="http://schemas.openxmlformats.org/drawingml/2006/wordprocessingDrawing" xmlns:w10="urn:schemas-microsoft-com:office:word" xmlns:w="http://schemas.openxmlformats.org/wordprocessingml/2006/main" xmlns:w14="http://schemas.microsoft.com/office/word/2010/wordml" xmlns:w15="http://schemas.microsoft.com/office/word/2012/wordml" xmlns:w16cex="http://schemas.microsoft.com/office/word/2018/wordml/cex" xmlns:w16cid="http://schemas.microsoft.com/office/word/2016/wordml/cid" xmlns:w16="http://schemas.microsoft.com/office/word/2018/wordml" xmlns:w16du="http://schemas.microsoft.com/office/word/2023/wordml/word16du" xmlns:w16sdtdh="http://schemas.microsoft.com/office/word/2020/wordml/sdtdatahash" xmlns:w16sdtfl="http://schemas.microsoft.com/office/word/2024/wordml/sdtformatlock" xmlns:w16se="http://schemas.microsoft.com/office/word/2015/wordml/symex" xmlns:wpg="http://schemas.microsoft.com/office/word/2010/wordprocessingGroup" xmlns:wpi="http://schemas.microsoft.com/office/word/2010/wordprocessingInk" xmlns:wne="http://schemas.microsoft.com/office/word/2006/wordml" xmlns:wps="http://schemas.microsoft.com/office/word/2010/wordprocessingShape" mc:Ignorable="w14 w15 w16se w16cid w16 w16cex w16sdtdh w16sdtfl w16du wp14">
   <w:body>
     <w:p>
-      <w:r>
+      <w:pPr>
         <w:rPr>
           <w:noProof/>
         </w:rPr>
-        <w:drawing>
-          <wp:inline distT="0" distB="0" distL="0" distR="0" wp14:anchorId="648E42B0" wp14:editId="6495357A">
-            <wp:extent cx="5943600" cy="3343275"/>
-            <wp:effectExtent l="0" t="0" r="0" b="9525"/>
-            <wp:docPr id="288385506" name="Picture 1"/>
-            <wp:cNvGraphicFramePr>
-              <a:graphicFrameLocks xmlns:a="http://schemas.openxmlformats.org/drawingml/2006/main" noChangeAspect="1"/>
-            </wp:cNvGraphicFramePr>
-            <a:graphic xmlns:a="http://schemas.openxmlformats.org/drawingml/2006/main">
-              <a:graphicData uri="http://schemas.openxmlformats.org/drawingml/2006/picture">
-                <pic:pic xmlns:pic="http://schemas.openxmlformats.org/drawingml/2006/picture">
-                  <pic:nvPicPr>
-                    <pic:cNvPr id="0" name="Picture 1"/>
-                    <pic:cNvPicPr>
-                      <a:picLocks noChangeAspect="1" noChangeArrowheads="1"/>
-                    </pic:cNvPicPr>
-                  </pic:nvPicPr>
-                  <pic:blipFill>
-                    <a:blip r:embed="rId4" cstate="print">
-                      <a:extLst>
-                        <a:ext uri="{28A0092B-C50C-407E-A947-70E740481C1C}">
-                          <a14:useLocalDpi xmlns:a14="http://schemas.microsoft.com/office/drawing/2010/main" val="0"/>
-                        </a:ext>
-                      </a:extLst>
-                    </a:blip>
-                    <a:srcRect/>
-                    <a:stretch>
-                      <a:fillRect/>
-                    </a:stretch>
-                  </pic:blipFill>
-                  <pic:spPr bwMode="auto">
-                    <a:xfrm>
-                      <a:off x="0" y="0"/>
-                      <a:ext cx="5943600" cy="3343275"/>
-                    </a:xfrm>
-                    <a:prstGeom prst="rect">
-                      <a:avLst/>
-                    </a:prstGeom>
-                    <a:noFill/>
-                    <a:ln>
-                      <a:noFill/>
-                    </a:ln>
-                  </pic:spPr>
-                </pic:pic>
-              </a:graphicData>
-            </a:graphic>
-          </wp:inline>
-        </w:drawing>
-      </w:r>
-    </w:p>
+      </w:pPr>
+      <w:r>
+        <w:rPr>
+          <w:noProof/>
+        </w:rPr>
+        <w:t>Problem 1:</w:t>
+      </w:r>
+    </w:p>
+    <w:p>
+      <w:r>
+        <w:t>package Labs.Week_1.scr;</w:t>
+      </w:r>
+    </w:p>
+    <w:p/>
+    <w:p>
+      <w:r>
+        <w:t xml:space="preserve">import </w:t>
+      </w:r>
+      <w:proofErr w:type="spellStart"/>
+      <w:proofErr w:type="gramStart"/>
+      <w:r>
+        <w:t>java.util</w:t>
+      </w:r>
+      <w:proofErr w:type="gramEnd"/>
+      <w:r>
+        <w:t>.Scanner</w:t>
+      </w:r>
+      <w:proofErr w:type="spellEnd"/>
+      <w:r>
+        <w:t>;</w:t>
+      </w:r>
+    </w:p>
+    <w:p>
+      <w:r>
+        <w:t xml:space="preserve">public class </w:t>
+      </w:r>
+      <w:proofErr w:type="spellStart"/>
+      <w:r>
+        <w:t>SalesBarChart</w:t>
+      </w:r>
+      <w:proofErr w:type="spellEnd"/>
+      <w:r>
+        <w:t xml:space="preserve"> {</w:t>
+      </w:r>
+    </w:p>
+    <w:p>
+      <w:r>
+        <w:t>    public static void main (String</w:t>
+      </w:r>
+      <w:proofErr w:type="gramStart"/>
+      <w:r>
+        <w:t>[]</w:t>
+      </w:r>
+      <w:proofErr w:type="spellStart"/>
+      <w:r>
+        <w:t>args</w:t>
+      </w:r>
+      <w:proofErr w:type="spellEnd"/>
+      <w:r>
+        <w:t>){</w:t>
+      </w:r>
+      <w:proofErr w:type="gramEnd"/>
+    </w:p>
+    <w:p>
+      <w:r>
+        <w:t>        Scanner input = new Scanner (System.in);</w:t>
+      </w:r>
+    </w:p>
+    <w:p>
+      <w:r>
+        <w:t>        int s;</w:t>
+      </w:r>
+    </w:p>
+    <w:p>
+      <w:r>
+        <w:t>        double p;</w:t>
+      </w:r>
+    </w:p>
+    <w:p>
+      <w:r>
+        <w:t xml:space="preserve">        String </w:t>
+      </w:r>
+      <w:proofErr w:type="spellStart"/>
+      <w:r>
+        <w:t>ast</w:t>
+      </w:r>
+      <w:proofErr w:type="spellEnd"/>
+      <w:r>
+        <w:t xml:space="preserve"> = "";</w:t>
+      </w:r>
+    </w:p>
+    <w:p>
+      <w:r>
+        <w:t xml:space="preserve">        </w:t>
+      </w:r>
+      <w:proofErr w:type="spellStart"/>
+      <w:r>
+        <w:t>System.out.print</w:t>
+      </w:r>
+      <w:proofErr w:type="spellEnd"/>
+      <w:r>
+        <w:t>("Enter the number of stores: ");</w:t>
+      </w:r>
+    </w:p>
+    <w:p>
+      <w:r>
+        <w:t xml:space="preserve">        s = </w:t>
+      </w:r>
+      <w:proofErr w:type="spellStart"/>
+      <w:proofErr w:type="gramStart"/>
+      <w:r>
+        <w:t>input.nextInt</w:t>
+      </w:r>
+      <w:proofErr w:type="spellEnd"/>
+      <w:proofErr w:type="gramEnd"/>
+      <w:r>
+        <w:t>();</w:t>
+      </w:r>
+    </w:p>
+    <w:p/>
+    <w:p>
+      <w:r>
+        <w:t>        for (int x=0; x&lt;s; x+</w:t>
+      </w:r>
+      <w:proofErr w:type="gramStart"/>
+      <w:r>
+        <w:t>+){</w:t>
+      </w:r>
+      <w:proofErr w:type="gramEnd"/>
+    </w:p>
+    <w:p>
+      <w:r>
+        <w:t xml:space="preserve">            </w:t>
+      </w:r>
+      <w:proofErr w:type="spellStart"/>
+      <w:r>
+        <w:t>System.out.print</w:t>
+      </w:r>
+      <w:proofErr w:type="spellEnd"/>
+      <w:r>
+        <w:t>("Enter Today's Sales for Store "+(x+</w:t>
+      </w:r>
+      <w:proofErr w:type="gramStart"/>
+      <w:r>
+        <w:t>1)+</w:t>
+      </w:r>
+      <w:proofErr w:type="gramEnd"/>
+      <w:r>
+        <w:t>": ");</w:t>
+      </w:r>
+    </w:p>
+    <w:p>
+      <w:r>
+        <w:t xml:space="preserve">            double y = </w:t>
+      </w:r>
+      <w:proofErr w:type="spellStart"/>
+      <w:proofErr w:type="gramStart"/>
+      <w:r>
+        <w:t>input.nextDouble</w:t>
+      </w:r>
+      <w:proofErr w:type="spellEnd"/>
+      <w:proofErr w:type="gramEnd"/>
+      <w:r>
+        <w:t>();</w:t>
+      </w:r>
+    </w:p>
+    <w:p>
+      <w:r>
+        <w:t>            y = y/100;</w:t>
+      </w:r>
+    </w:p>
+    <w:p>
+      <w:r>
+        <w:t xml:space="preserve">            </w:t>
+      </w:r>
+      <w:proofErr w:type="spellStart"/>
+      <w:r>
+        <w:t>ast</w:t>
+      </w:r>
+      <w:proofErr w:type="spellEnd"/>
+      <w:r>
+        <w:t xml:space="preserve"> = </w:t>
+      </w:r>
+      <w:proofErr w:type="spellStart"/>
+      <w:r>
+        <w:t>ast</w:t>
+      </w:r>
+      <w:proofErr w:type="spellEnd"/>
+      <w:r>
+        <w:t>+"Store "+(x+</w:t>
+      </w:r>
+      <w:proofErr w:type="gramStart"/>
+      <w:r>
+        <w:t>1)+</w:t>
+      </w:r>
+      <w:proofErr w:type="gramEnd"/>
+      <w:r>
+        <w:t>": ";</w:t>
+      </w:r>
+    </w:p>
+    <w:p>
+      <w:r>
+        <w:t>            for (p=0; p&lt;y; p+</w:t>
+      </w:r>
+      <w:proofErr w:type="gramStart"/>
+      <w:r>
+        <w:t>+){</w:t>
+      </w:r>
+      <w:proofErr w:type="gramEnd"/>
+    </w:p>
+    <w:p>
+      <w:r>
+        <w:t xml:space="preserve">                </w:t>
+      </w:r>
+      <w:proofErr w:type="spellStart"/>
+      <w:r>
+        <w:t>ast</w:t>
+      </w:r>
+      <w:proofErr w:type="spellEnd"/>
+      <w:r>
+        <w:t xml:space="preserve"> = </w:t>
+      </w:r>
+      <w:proofErr w:type="spellStart"/>
+      <w:r>
+        <w:t>ast</w:t>
+      </w:r>
+      <w:proofErr w:type="spellEnd"/>
+      <w:r>
+        <w:t>+"*";</w:t>
+      </w:r>
+    </w:p>
+    <w:p>
+      <w:r>
+        <w:t>            }</w:t>
+      </w:r>
+    </w:p>
+    <w:p>
+      <w:r>
+        <w:t xml:space="preserve">            </w:t>
+      </w:r>
+      <w:proofErr w:type="spellStart"/>
+      <w:r>
+        <w:t>ast</w:t>
+      </w:r>
+      <w:proofErr w:type="spellEnd"/>
+      <w:r>
+        <w:t xml:space="preserve"> = </w:t>
+      </w:r>
+      <w:proofErr w:type="spellStart"/>
+      <w:r>
+        <w:t>ast</w:t>
+      </w:r>
+      <w:proofErr w:type="spellEnd"/>
+      <w:r>
+        <w:t>+"\n";</w:t>
+      </w:r>
+    </w:p>
+    <w:p>
+      <w:r>
+        <w:t>        }</w:t>
+      </w:r>
+    </w:p>
+    <w:p>
+      <w:r>
+        <w:t xml:space="preserve">        </w:t>
+      </w:r>
+      <w:proofErr w:type="spellStart"/>
+      <w:r>
+        <w:t>System.out.println</w:t>
+      </w:r>
+      <w:proofErr w:type="spellEnd"/>
+      <w:r>
+        <w:t>("SALES BAR CHART");</w:t>
+      </w:r>
+    </w:p>
+    <w:p>
+      <w:r>
+        <w:t xml:space="preserve">        </w:t>
+      </w:r>
+      <w:proofErr w:type="spellStart"/>
+      <w:r>
+        <w:t>System.out.println</w:t>
+      </w:r>
+      <w:proofErr w:type="spellEnd"/>
+      <w:r>
+        <w:t>("(Each * = $100)");</w:t>
+      </w:r>
+    </w:p>
+    <w:p>
+      <w:r>
+        <w:t xml:space="preserve">        </w:t>
+      </w:r>
+      <w:proofErr w:type="spellStart"/>
+      <w:r>
+        <w:t>System.out.print</w:t>
+      </w:r>
+      <w:proofErr w:type="spellEnd"/>
+      <w:r>
+        <w:t>(</w:t>
+      </w:r>
+      <w:proofErr w:type="spellStart"/>
+      <w:r>
+        <w:t>ast</w:t>
+      </w:r>
+      <w:proofErr w:type="spellEnd"/>
+      <w:r>
+        <w:t>);</w:t>
+      </w:r>
+    </w:p>
+    <w:p>
+      <w:r>
+        <w:lastRenderedPageBreak/>
+        <w:t xml:space="preserve">    }   </w:t>
+      </w:r>
+    </w:p>
+    <w:p>
+      <w:r>
+        <w:t>}</w:t>
+      </w:r>
+    </w:p>
+    <w:p/>
+    <w:p>
+      <w:r>
+        <w:t>Problem 2:</w:t>
+      </w:r>
+    </w:p>
+    <w:p/>
     <w:sectPr>
       <w:pgSz w:w="12240" w:h="15840"/>
       <w:pgMar w:top="1440" w:right="1440" w:bottom="1440" w:left="1440" w:header="720" w:footer="720" w:gutter="0"/>
@@ -670,7 +947,6 @@
   <w:style w:type="character" w:default="1" w:styleId="DefaultParagraphFont">
     <w:name w:val="Default Paragraph Font"/>
     <w:uiPriority w:val="1"/>
-    <w:semiHidden/>
     <w:unhideWhenUsed/>
   </w:style>
   <w:style w:type="table" w:default="1" w:styleId="TableNormal">

</xml_diff>